<commit_message>
feat: add dynamic official settings for docx generation
</commit_message>
<xml_diff>
--- a/storage/template/magang/Format_Surat_Izin_Magang.docx
+++ b/storage/template/magang/Format_Surat_Izin_Magang.docx
@@ -563,7 +563,7 @@
           <w:sz w:val="24"/>
           <w:szCs w:val="24"/>
         </w:rPr>
-        <w:t>Kepala Bagian Tata Usaha dan Umum</w:t>
+        <w:t>[jabatan_pejabat]</w:t>
       </w:r>
     </w:p>
     <w:p>
@@ -660,27 +660,7 @@
           <w:szCs w:val="24"/>
           <w:lang w:val="en-US"/>
         </w:rPr>
-        <w:t xml:space="preserve">R. </w:t>
-      </w:r>
-      <w:proofErr w:type="spellStart"/>
-      <w:r>
-        <w:rPr>
-          <w:color w:val="000000"/>
-          <w:sz w:val="24"/>
-          <w:szCs w:val="24"/>
-          <w:lang w:val="en-US"/>
-        </w:rPr>
-        <w:t>Prasetyo</w:t>
-      </w:r>
-      <w:proofErr w:type="spellEnd"/>
-      <w:r>
-        <w:rPr>
-          <w:color w:val="000000"/>
-          <w:sz w:val="24"/>
-          <w:szCs w:val="24"/>
-          <w:lang w:val="en-US"/>
-        </w:rPr>
-        <w:t xml:space="preserve"> Wibowo</w:t>
+        <w:t>[nama_pejabat]</w:t>
       </w:r>
     </w:p>
     <w:p/>

</xml_diff>

<commit_message>
melakukan perubahan pada persyaratan
</commit_message>
<xml_diff>
--- a/storage/template/magang/Format_Surat_Izin_Magang.docx
+++ b/storage/template/magang/Format_Surat_Izin_Magang.docx
@@ -209,27 +209,7 @@
           <w:szCs w:val="24"/>
           <w:lang w:val="en-US"/>
         </w:rPr>
-        <w:t>[</w:t>
-      </w:r>
-      <w:proofErr w:type="gramStart"/>
-      <w:r>
-        <w:rPr>
-          <w:color w:val="000000"/>
-          <w:sz w:val="24"/>
-          <w:szCs w:val="24"/>
-          <w:lang w:val="en-US"/>
-        </w:rPr>
-        <w:t>…..</w:t>
-      </w:r>
-      <w:proofErr w:type="gramEnd"/>
-      <w:r>
-        <w:rPr>
-          <w:color w:val="000000"/>
-          <w:sz w:val="24"/>
-          <w:szCs w:val="24"/>
-          <w:lang w:val="en-US"/>
-        </w:rPr>
-        <w:t>4]</w:t>
+        <w:t>[…..4]</w:t>
       </w:r>
     </w:p>
     <w:p>
@@ -332,43 +312,7 @@
           <w:sz w:val="24"/>
           <w:szCs w:val="24"/>
         </w:rPr>
-        <w:t>tanggal [</w:t>
-      </w:r>
-      <w:proofErr w:type="gramStart"/>
-      <w:r>
-        <w:rPr>
-          <w:color w:val="000000"/>
-          <w:sz w:val="24"/>
-          <w:szCs w:val="24"/>
-        </w:rPr>
-        <w:t>.....</w:t>
-      </w:r>
-      <w:proofErr w:type="gramEnd"/>
-      <w:r>
-        <w:rPr>
-          <w:color w:val="000000"/>
-          <w:sz w:val="24"/>
-          <w:szCs w:val="24"/>
-        </w:rPr>
-        <w:t>7</w:t>
-      </w:r>
-      <w:proofErr w:type="gramStart"/>
-      <w:r>
-        <w:rPr>
-          <w:color w:val="000000"/>
-          <w:sz w:val="24"/>
-          <w:szCs w:val="24"/>
-        </w:rPr>
-        <w:t>] ,</w:t>
-      </w:r>
-      <w:proofErr w:type="gramEnd"/>
-      <w:r>
-        <w:rPr>
-          <w:color w:val="000000"/>
-          <w:sz w:val="24"/>
-          <w:szCs w:val="24"/>
-        </w:rPr>
-        <w:t xml:space="preserve"> perihal </w:t>
+        <w:t xml:space="preserve">tanggal [.....7] , perihal </w:t>
       </w:r>
       <w:r>
         <w:rPr>
@@ -394,25 +338,7 @@
           <w:sz w:val="24"/>
           <w:szCs w:val="24"/>
         </w:rPr>
-        <w:t>, bersama ini disampaikan bahwa pada prinsipnya kami berkenan menerima [....8</w:t>
-      </w:r>
-      <w:proofErr w:type="gramStart"/>
-      <w:r>
-        <w:rPr>
-          <w:color w:val="000000"/>
-          <w:sz w:val="24"/>
-          <w:szCs w:val="24"/>
-        </w:rPr>
-        <w:t>]  dengan</w:t>
-      </w:r>
-      <w:proofErr w:type="gramEnd"/>
-      <w:r>
-        <w:rPr>
-          <w:color w:val="000000"/>
-          <w:sz w:val="24"/>
-          <w:szCs w:val="24"/>
-        </w:rPr>
-        <w:t xml:space="preserve"> identitas berikut:</w:t>
+        <w:t>, bersama ini disampaikan bahwa pada prinsipnya kami berkenan menerima [....8]  dengan identitas berikut:</w:t>
       </w:r>
     </w:p>
     <w:p>
@@ -660,9 +586,8 @@
           <w:szCs w:val="24"/>
           <w:lang w:val="en-US"/>
         </w:rPr>
-        <w:t xml:space="preserve">R. </w:t>
-      </w:r>
-      <w:proofErr w:type="spellStart"/>
+        <w:t>R</w:t>
+      </w:r>
       <w:r>
         <w:rPr>
           <w:color w:val="000000"/>
@@ -670,17 +595,7 @@
           <w:szCs w:val="24"/>
           <w:lang w:val="en-US"/>
         </w:rPr>
-        <w:t>Prasetyo</w:t>
-      </w:r>
-      <w:proofErr w:type="spellEnd"/>
-      <w:r>
-        <w:rPr>
-          <w:color w:val="000000"/>
-          <w:sz w:val="24"/>
-          <w:szCs w:val="24"/>
-          <w:lang w:val="en-US"/>
-        </w:rPr>
-        <w:t xml:space="preserve"> Wibowo</w:t>
+        <w:t>afif Muhammad</w:t>
       </w:r>
     </w:p>
     <w:p/>
@@ -1030,7 +945,7 @@
             </wp:anchor>
           </w:drawing>
         </mc:Choice>
-        <mc:Fallback xmlns:sl="http://schemas.openxmlformats.org/schemaLibrary/2006/main" xmlns:a="http://schemas.openxmlformats.org/drawingml/2006/main" xmlns:pic="http://schemas.openxmlformats.org/drawingml/2006/picture" xmlns:c="http://schemas.openxmlformats.org/drawingml/2006/chart" xmlns:lc="http://schemas.openxmlformats.org/drawingml/2006/lockedCanvas" xmlns:dgm="http://schemas.openxmlformats.org/drawingml/2006/diagram" xmlns="http://schemas.microsoft.com/office/tasks/2019/documenttasks" xmlns:cr="http://schemas.microsoft.com/office/comments/2020/reactions">
+        <mc:Fallback xmlns:cr="http://schemas.microsoft.com/office/comments/2020/reactions" xmlns="http://schemas.microsoft.com/office/tasks/2019/documenttasks" xmlns:dgm="http://schemas.openxmlformats.org/drawingml/2006/diagram" xmlns:lc="http://schemas.openxmlformats.org/drawingml/2006/lockedCanvas" xmlns:c="http://schemas.openxmlformats.org/drawingml/2006/chart" xmlns:pic="http://schemas.openxmlformats.org/drawingml/2006/picture" xmlns:a="http://schemas.openxmlformats.org/drawingml/2006/main" xmlns:sl="http://schemas.openxmlformats.org/schemaLibrary/2006/main">
           <w:drawing>
             <wp:anchor allowOverlap="1" behindDoc="0" distB="0" distT="0" distL="114300" distR="114300" hidden="0" layoutInCell="1" locked="0" relativeHeight="0" simplePos="0">
               <wp:simplePos x="0" y="0"/>

</xml_diff>

<commit_message>
Push all backend code changes
</commit_message>
<xml_diff>
--- a/storage/template/magang/Format_Surat_Izin_Magang.docx
+++ b/storage/template/magang/Format_Surat_Izin_Magang.docx
@@ -209,7 +209,27 @@
           <w:szCs w:val="24"/>
           <w:lang w:val="en-US"/>
         </w:rPr>
-        <w:t>[…..4]</w:t>
+        <w:t>[</w:t>
+      </w:r>
+      <w:proofErr w:type="gramStart"/>
+      <w:r>
+        <w:rPr>
+          <w:color w:val="000000"/>
+          <w:sz w:val="24"/>
+          <w:szCs w:val="24"/>
+          <w:lang w:val="en-US"/>
+        </w:rPr>
+        <w:t>…..</w:t>
+      </w:r>
+      <w:proofErr w:type="gramEnd"/>
+      <w:r>
+        <w:rPr>
+          <w:color w:val="000000"/>
+          <w:sz w:val="24"/>
+          <w:szCs w:val="24"/>
+          <w:lang w:val="en-US"/>
+        </w:rPr>
+        <w:t>4]</w:t>
       </w:r>
     </w:p>
     <w:p>
@@ -312,33 +332,77 @@
           <w:sz w:val="24"/>
           <w:szCs w:val="24"/>
         </w:rPr>
-        <w:t xml:space="preserve">tanggal [.....7] , perihal </w:t>
-      </w:r>
-      <w:r>
-        <w:rPr>
-          <w:color w:val="000000"/>
-          <w:sz w:val="24"/>
-          <w:szCs w:val="24"/>
-        </w:rPr>
-        <w:t xml:space="preserve">Permohonan bantuan tempat magang/kerja </w:t>
-      </w:r>
-      <w:proofErr w:type="spellStart"/>
-      <w:r>
-        <w:rPr>
-          <w:color w:val="000000"/>
-          <w:sz w:val="24"/>
-          <w:szCs w:val="24"/>
-        </w:rPr>
-        <w:t>praktek</w:t>
-      </w:r>
-      <w:proofErr w:type="spellEnd"/>
-      <w:r>
-        <w:rPr>
-          <w:color w:val="000000"/>
-          <w:sz w:val="24"/>
-          <w:szCs w:val="24"/>
-        </w:rPr>
-        <w:t>, bersama ini disampaikan bahwa pada prinsipnya kami berkenan menerima [....8]  dengan identitas berikut:</w:t>
+        <w:t>tanggal [</w:t>
+      </w:r>
+      <w:proofErr w:type="gramStart"/>
+      <w:r>
+        <w:rPr>
+          <w:color w:val="000000"/>
+          <w:sz w:val="24"/>
+          <w:szCs w:val="24"/>
+        </w:rPr>
+        <w:t>.....</w:t>
+      </w:r>
+      <w:proofErr w:type="gramEnd"/>
+      <w:r>
+        <w:rPr>
+          <w:color w:val="000000"/>
+          <w:sz w:val="24"/>
+          <w:szCs w:val="24"/>
+        </w:rPr>
+        <w:t>7</w:t>
+      </w:r>
+      <w:proofErr w:type="gramStart"/>
+      <w:r>
+        <w:rPr>
+          <w:color w:val="000000"/>
+          <w:sz w:val="24"/>
+          <w:szCs w:val="24"/>
+        </w:rPr>
+        <w:t>] ,</w:t>
+      </w:r>
+      <w:proofErr w:type="gramEnd"/>
+      <w:r>
+        <w:rPr>
+          <w:color w:val="000000"/>
+          <w:sz w:val="24"/>
+          <w:szCs w:val="24"/>
+        </w:rPr>
+        <w:t xml:space="preserve"> perihal </w:t>
+      </w:r>
+      <w:r>
+        <w:rPr>
+          <w:color w:val="000000"/>
+          <w:sz w:val="24"/>
+          <w:szCs w:val="24"/>
+        </w:rPr>
+        <w:t>Permohonan bantuan tempat magang/kerja praktek</w:t>
+      </w:r>
+      <w:r>
+        <w:rPr>
+          <w:color w:val="000000"/>
+          <w:sz w:val="24"/>
+          <w:szCs w:val="24"/>
+        </w:rPr>
+        <w:t>, bersama ini disampaikan bahwa pada prinsipnya kami berkenan menerima [....8</w:t>
+      </w:r>
+      <w:proofErr w:type="gramStart"/>
+      <w:r>
+        <w:rPr>
+          <w:color w:val="000000"/>
+          <w:sz w:val="24"/>
+          <w:szCs w:val="24"/>
+        </w:rPr>
+        <w:t>]  dengan</w:t>
+      </w:r>
+      <w:proofErr w:type="gramEnd"/>
+      <w:r>
+        <w:rPr>
+          <w:color w:val="000000"/>
+          <w:sz w:val="24"/>
+          <w:szCs w:val="24"/>
+        </w:rPr>
+        <w:t xml:space="preserve"> identitas berikut:</w:t>
       </w:r>
     </w:p>
     <w:p>
@@ -595,7 +659,27 @@
           <w:szCs w:val="24"/>
           <w:lang w:val="en-US"/>
         </w:rPr>
-        <w:t>afif Muhammad</w:t>
+        <w:t xml:space="preserve">. </w:t>
+      </w:r>
+      <w:proofErr w:type="spellStart"/>
+      <w:r>
+        <w:rPr>
+          <w:color w:val="000000"/>
+          <w:sz w:val="24"/>
+          <w:szCs w:val="24"/>
+          <w:lang w:val="en-US"/>
+        </w:rPr>
+        <w:t>Prasetyo</w:t>
+      </w:r>
+      <w:proofErr w:type="spellEnd"/>
+      <w:r>
+        <w:rPr>
+          <w:color w:val="000000"/>
+          <w:sz w:val="24"/>
+          <w:szCs w:val="24"/>
+          <w:lang w:val="en-US"/>
+        </w:rPr>
+        <w:t xml:space="preserve"> Wibowo</w:t>
       </w:r>
     </w:p>
     <w:p/>
@@ -830,25 +914,7 @@
         <w:sz w:val="20"/>
         <w:szCs w:val="20"/>
       </w:rPr>
-      <w:t xml:space="preserve">Jalan </w:t>
-    </w:r>
-    <w:proofErr w:type="spellStart"/>
-    <w:r>
-      <w:rPr>
-        <w:color w:val="000000"/>
-        <w:sz w:val="20"/>
-        <w:szCs w:val="20"/>
-      </w:rPr>
-      <w:t>Kayoon</w:t>
-    </w:r>
-    <w:proofErr w:type="spellEnd"/>
-    <w:r>
-      <w:rPr>
-        <w:color w:val="000000"/>
-        <w:sz w:val="20"/>
-        <w:szCs w:val="20"/>
-      </w:rPr>
-      <w:t xml:space="preserve"> No. 50-52, Genteng, Surabaya, Jawa Timur 60271 </w:t>
+      <w:t xml:space="preserve">Jalan Kayoon No. 50-52, Genteng, Surabaya, Jawa Timur 60271 </w:t>
     </w:r>
   </w:p>
   <w:p>
@@ -945,7 +1011,7 @@
             </wp:anchor>
           </w:drawing>
         </mc:Choice>
-        <mc:Fallback xmlns:cr="http://schemas.microsoft.com/office/comments/2020/reactions" xmlns="http://schemas.microsoft.com/office/tasks/2019/documenttasks" xmlns:dgm="http://schemas.openxmlformats.org/drawingml/2006/diagram" xmlns:lc="http://schemas.openxmlformats.org/drawingml/2006/lockedCanvas" xmlns:c="http://schemas.openxmlformats.org/drawingml/2006/chart" xmlns:pic="http://schemas.openxmlformats.org/drawingml/2006/picture" xmlns:a="http://schemas.openxmlformats.org/drawingml/2006/main" xmlns:sl="http://schemas.openxmlformats.org/schemaLibrary/2006/main">
+        <mc:Fallback xmlns:sl="http://schemas.openxmlformats.org/schemaLibrary/2006/main" xmlns:a="http://schemas.openxmlformats.org/drawingml/2006/main" xmlns:pic="http://schemas.openxmlformats.org/drawingml/2006/picture" xmlns:c="http://schemas.openxmlformats.org/drawingml/2006/chart" xmlns:lc="http://schemas.openxmlformats.org/drawingml/2006/lockedCanvas" xmlns:dgm="http://schemas.openxmlformats.org/drawingml/2006/diagram" xmlns="http://schemas.microsoft.com/office/tasks/2019/documenttasks" xmlns:cr="http://schemas.microsoft.com/office/comments/2020/reactions">
           <w:drawing>
             <wp:anchor allowOverlap="1" behindDoc="0" distB="0" distT="0" distL="114300" distR="114300" hidden="0" layoutInCell="1" locked="0" relativeHeight="0" simplePos="0">
               <wp:simplePos x="0" y="0"/>
@@ -1009,25 +1075,7 @@
         <w:sz w:val="20"/>
         <w:szCs w:val="20"/>
       </w:rPr>
-      <w:t xml:space="preserve"> Pos-</w:t>
-    </w:r>
-    <w:proofErr w:type="spellStart"/>
-    <w:r>
-      <w:rPr>
-        <w:color w:val="000000"/>
-        <w:sz w:val="20"/>
-        <w:szCs w:val="20"/>
-      </w:rPr>
-      <w:t>el</w:t>
-    </w:r>
-    <w:proofErr w:type="spellEnd"/>
-    <w:r>
-      <w:rPr>
-        <w:color w:val="000000"/>
-        <w:sz w:val="20"/>
-        <w:szCs w:val="20"/>
-      </w:rPr>
-      <w:t>: kanwiljatim@kemenkum.go.id</w:t>
+      <w:t xml:space="preserve"> Pos-el: kanwiljatim@kemenkum.go.id</w:t>
     </w:r>
   </w:p>
 </w:hdr>

</xml_diff>